<commit_message>
october stubs for all
</commit_message>
<xml_diff>
--- a/flow/20230927_hours/drafts/2024-09-u/01.09.docx
+++ b/flow/20230927_hours/drafts/2024-09-u/01.09.docx
@@ -3530,7 +3530,7 @@
           <w:rFonts w:ascii="Times New Roman" w:hAnsi="Times New Roman"/>
           <w:sz w:val="24"/>
         </w:rPr>
-        <w:t xml:space="preserve">Хто він, той людина, що Господа боїться?* Він </w:t>
+        <w:t xml:space="preserve">Хто він, той чоловік, що Господа боїться?* Він </w:t>
       </w:r>
       <w:proofErr w:type="spellStart"/>
       <w:r>
@@ -7795,7 +7795,7 @@
           <w:rFonts w:ascii="Times New Roman" w:hAnsi="Times New Roman"/>
           <w:sz w:val="24"/>
         </w:rPr>
-        <w:t xml:space="preserve">Боже й Господи сил і всього творіння Сотворителю! Ти з милосердя і незрівнянної милости твоєї послав на спасіння роду нашого єдинородного Сина твого, Господа нашого, Ісуса Христа, і дорогоцінним його хрестом розписку гріхів наших розірвав і переміг начало й владу темряви. Тож, Владико людинолюбний, прийми від нас грішних ці вдячні і благальні молитви, і визволь нас від усякого згубного й темного гріха, і від усіх видимих і невидимих ворогів, що бажають вчинити нам зло. До страху твого прикуй тіла наші й не допусти сердець наших до слів, або помислів лукавих, але любов’ю твоєю пройми душі наші, щоб, повсякчас на тебе дивлячись і світлом твоїм керуючись, бачили тебе, неприступне й вічне світло, та щоб невпинно хвалу й подяку віддавали тобі: безначальному Отцеві з єдинородним твоїм Сином і </w:t>
+        <w:t xml:space="preserve">Боже й Господи сил і всього творіння Сотворителю! Ти з милосердя і незрівнянної милости твоєї послав на спасіння роду нашого єдинородного Сина твого, Господа нашого, Ісуса Христа, і дорогоцінним його хрестом розписку гріхів наших розірвав і переміг начало й владу темряви. Тож, Владико чоловіколюбний, прийми від нас грішних ці вдячні і благальні молитви, і визволь нас від усякого згубного й темного гріха, і від усіх видимих і невидимих ворогів, що бажають вчинити нам зло. До страху твого прикуй тіла наші й не допусти сердець наших до слів, або помислів лукавих, але любов’ю твоєю пройми душі наші, щоб, повсякчас на тебе дивлячись і світлом твоїм керуючись, бачили тебе, неприступне й вічне світло, та щоб невпинно хвалу й подяку віддавали тобі: безначальному Отцеві з єдинородним твоїм Сином і </w:t>
       </w:r>
       <w:proofErr w:type="spellStart"/>
       <w:r>
@@ -8594,7 +8594,7 @@
           <w:rFonts w:ascii="Times New Roman" w:hAnsi="Times New Roman"/>
           <w:sz w:val="24"/>
         </w:rPr>
-        <w:t>Щасливий людина, що має свою силу в тобі* і твої дороги має в своєму серці.</w:t>
+        <w:t>Щасливий чоловік, що має свою силу в тобі* і твої дороги має в своєму серці.</w:t>
       </w:r>
     </w:p>
     <w:p>
@@ -8707,7 +8707,7 @@
           <w:rFonts w:ascii="Times New Roman" w:hAnsi="Times New Roman"/>
           <w:sz w:val="24"/>
         </w:rPr>
-        <w:t>Господи сил!* Щасливий людина, що покладається на тебе!</w:t>
+        <w:t>Господи сил!* Щасливий чоловік, що покладається на тебе!</w:t>
       </w:r>
     </w:p>
     <w:p>
@@ -9547,7 +9547,7 @@
           <w:rFonts w:ascii="Times New Roman" w:hAnsi="Times New Roman"/>
           <w:sz w:val="24"/>
         </w:rPr>
-        <w:t xml:space="preserve"> воскресіння,* не погорди тими, що їх ти створив рукою своєю.* Покажи, Милостивий, своє людинолюбство,* прийми Богородицю, що тебе породила і молиться за нас,* і спаси, Спасе наш, людей зневірених.</w:t>
+        <w:t xml:space="preserve"> воскресіння,* не погорди тими, що їх ти створив рукою своєю.* Покажи, Милостивий, своє чоловіколюбство,* прийми Богородицю, що тебе породила і молиться за нас,* і спаси, Спасе наш, людей зневірених.</w:t>
       </w:r>
     </w:p>
     <w:p>

</xml_diff>